<commit_message>
feat: acta técnica dinámica — firmas, elaborador y fotos
- Template Word: elimina nombres hardcodeados, agrega {{elaborado_titulo}} {{elaborado_nombre}}
- Logic: reconstruye tabla de firmas con participantes del formulario (2 por fila)
- Logic: inserta fotos de evidencia en sección fotográfica del Word
- Form: campo cargo por participante, sección 'Elaborado por', upload de fotos múltiples

Co-Authored-By: Claude Sonnet 4.6 <noreply@anthropic.com>
</commit_message>
<xml_diff>
--- a/resources/Acta_Tecnica.docx
+++ b/resources/Acta_Tecnica.docx
@@ -883,23 +883,7 @@
               <w:jc w:val="center"/>
             </w:pPr>
             <w:r>
-              <w:t>{{</w:t>
-            </w:r>
-            <w:proofErr w:type="spellStart"/>
-            <w:r>
-              <w:t>convocante_nombre</w:t>
-            </w:r>
-            <w:proofErr w:type="spellEnd"/>
-            <w:r>
-              <w:t>}}, {{</w:t>
-            </w:r>
-            <w:proofErr w:type="spellStart"/>
-            <w:r>
-              <w:t>convocante_cargo</w:t>
-            </w:r>
-            <w:proofErr w:type="spellEnd"/>
-            <w:r>
-              <w:t>}}</w:t>
+              <w:t>{{convocante_nombre}}</w:t>
             </w:r>
           </w:p>
           <w:p>
@@ -929,7 +913,11 @@
               <w:rPr>
                 <w:lang w:val="es-EC"/>
               </w:rPr>
-              <w:t xml:space="preserve">Docente   </w:t>
+            </w:r>
+          </w:p>
+          <w:p>
+            <w:r>
+              <w:t>{{convocante_cargo}}</w:t>
             </w:r>
           </w:p>
         </w:tc>
@@ -947,10 +935,7 @@
               </w:rPr>
             </w:pPr>
             <w:r>
-              <w:rPr>
-                <w:lang w:val="pt-PT"/>
-              </w:rPr>
-              <w:t>Lic. Gabriel Bazurto Alcívar, Mg.</w:t>
+              <w:t>{{firma_0_1}}</w:t>
             </w:r>
           </w:p>
           <w:p>
@@ -965,323 +950,6 @@
               <w:rPr>
                 <w:lang w:val="pt-PT"/>
               </w:rPr>
-              <w:t>Docente</w:t>
-            </w:r>
-          </w:p>
-        </w:tc>
-      </w:tr>
-      <w:tr>
-        <w:trPr>
-          <w:trHeight w:val="2211"/>
-        </w:trPr>
-        <w:tc>
-          <w:tcPr>
-            <w:tcW w:w="4390" w:type="dxa"/>
-            <w:vAlign w:val="bottom"/>
-          </w:tcPr>
-          <w:p>
-            <w:pPr>
-              <w:spacing w:after="0"/>
-              <w:jc w:val="center"/>
-              <w:rPr>
-                <w:lang w:val="es-EC"/>
-              </w:rPr>
-            </w:pPr>
-            <w:proofErr w:type="spellStart"/>
-            <w:r>
-              <w:rPr>
-                <w:lang w:val="es-EC"/>
-              </w:rPr>
-              <w:t>Psic</w:t>
-            </w:r>
-            <w:proofErr w:type="spellEnd"/>
-            <w:r>
-              <w:rPr>
-                <w:lang w:val="es-EC"/>
-              </w:rPr>
-              <w:t>. Johanna Bello Piguave, Mg.</w:t>
-            </w:r>
-          </w:p>
-          <w:p>
-            <w:pPr>
-              <w:spacing w:after="0"/>
-              <w:jc w:val="center"/>
-              <w:rPr>
-                <w:lang w:val="pt-PT"/>
-              </w:rPr>
-            </w:pPr>
-            <w:r>
-              <w:rPr>
-                <w:lang w:val="pt-PT"/>
-              </w:rPr>
-              <w:t>Docente</w:t>
-            </w:r>
-          </w:p>
-        </w:tc>
-        <w:tc>
-          <w:tcPr>
-            <w:tcW w:w="4813" w:type="dxa"/>
-            <w:vAlign w:val="bottom"/>
-          </w:tcPr>
-          <w:p>
-            <w:pPr>
-              <w:spacing w:after="0"/>
-              <w:jc w:val="center"/>
-              <w:rPr>
-                <w:lang w:val="pt-PT"/>
-              </w:rPr>
-            </w:pPr>
-            <w:r>
-              <w:rPr>
-                <w:lang w:val="pt-PT"/>
-              </w:rPr>
-              <w:t>Lic. Germán Carrera Moreno, Mg.</w:t>
-            </w:r>
-          </w:p>
-          <w:p>
-            <w:pPr>
-              <w:spacing w:after="0"/>
-              <w:jc w:val="center"/>
-              <w:rPr>
-                <w:lang w:val="pt-PT"/>
-              </w:rPr>
-            </w:pPr>
-            <w:r>
-              <w:rPr>
-                <w:lang w:val="pt-PT"/>
-              </w:rPr>
-              <w:t>Docente</w:t>
-            </w:r>
-          </w:p>
-        </w:tc>
-      </w:tr>
-      <w:tr>
-        <w:trPr>
-          <w:trHeight w:val="2211"/>
-        </w:trPr>
-        <w:tc>
-          <w:tcPr>
-            <w:tcW w:w="4390" w:type="dxa"/>
-            <w:vAlign w:val="bottom"/>
-          </w:tcPr>
-          <w:p>
-            <w:pPr>
-              <w:spacing w:after="0"/>
-              <w:jc w:val="center"/>
-              <w:rPr>
-                <w:lang w:val="pt-PT"/>
-              </w:rPr>
-            </w:pPr>
-            <w:r>
-              <w:rPr>
-                <w:lang w:val="pt-PT"/>
-              </w:rPr>
-              <w:t>Lic. Verónica Chávez Zambrano, Mg.</w:t>
-            </w:r>
-          </w:p>
-          <w:p>
-            <w:pPr>
-              <w:spacing w:after="0"/>
-              <w:jc w:val="center"/>
-              <w:rPr>
-                <w:lang w:val="pt-PT"/>
-              </w:rPr>
-            </w:pPr>
-            <w:r>
-              <w:rPr>
-                <w:lang w:val="pt-PT"/>
-              </w:rPr>
-              <w:t>Docente</w:t>
-            </w:r>
-          </w:p>
-        </w:tc>
-        <w:tc>
-          <w:tcPr>
-            <w:tcW w:w="4813" w:type="dxa"/>
-            <w:vAlign w:val="bottom"/>
-          </w:tcPr>
-          <w:p>
-            <w:pPr>
-              <w:spacing w:after="0"/>
-              <w:jc w:val="center"/>
-              <w:rPr>
-                <w:lang w:val="es-EC"/>
-              </w:rPr>
-            </w:pPr>
-            <w:r>
-              <w:rPr>
-                <w:lang w:val="es-EC"/>
-              </w:rPr>
-              <w:t>Lic. Gonzalo Farfán Corrales, Mg.</w:t>
-            </w:r>
-          </w:p>
-          <w:p>
-            <w:pPr>
-              <w:spacing w:after="0"/>
-              <w:jc w:val="center"/>
-              <w:rPr>
-                <w:lang w:val="pt-PT"/>
-              </w:rPr>
-            </w:pPr>
-            <w:r>
-              <w:rPr>
-                <w:lang w:val="pt-PT"/>
-              </w:rPr>
-              <w:t>Docente</w:t>
-            </w:r>
-          </w:p>
-        </w:tc>
-      </w:tr>
-      <w:tr>
-        <w:trPr>
-          <w:trHeight w:val="2211"/>
-        </w:trPr>
-        <w:tc>
-          <w:tcPr>
-            <w:tcW w:w="4390" w:type="dxa"/>
-            <w:vAlign w:val="bottom"/>
-          </w:tcPr>
-          <w:p>
-            <w:pPr>
-              <w:spacing w:after="0"/>
-              <w:jc w:val="center"/>
-              <w:rPr>
-                <w:lang w:val="pt-PT"/>
-              </w:rPr>
-            </w:pPr>
-            <w:r>
-              <w:rPr>
-                <w:lang w:val="pt-PT"/>
-              </w:rPr>
-              <w:t>Lic. Laura Mena Sánchez, Mg.</w:t>
-            </w:r>
-          </w:p>
-          <w:p>
-            <w:pPr>
-              <w:spacing w:after="0"/>
-              <w:jc w:val="center"/>
-              <w:rPr>
-                <w:lang w:val="pt-PT"/>
-              </w:rPr>
-            </w:pPr>
-            <w:r>
-              <w:rPr>
-                <w:lang w:val="pt-PT"/>
-              </w:rPr>
-              <w:t>Docente</w:t>
-            </w:r>
-          </w:p>
-        </w:tc>
-        <w:tc>
-          <w:tcPr>
-            <w:tcW w:w="4813" w:type="dxa"/>
-            <w:vAlign w:val="bottom"/>
-          </w:tcPr>
-          <w:p>
-            <w:pPr>
-              <w:spacing w:after="0"/>
-              <w:jc w:val="center"/>
-              <w:rPr>
-                <w:lang w:val="es-EC"/>
-              </w:rPr>
-            </w:pPr>
-            <w:r>
-              <w:rPr>
-                <w:lang w:val="es-EC"/>
-              </w:rPr>
-              <w:t>Dr. Arturo Rodríguez Zambrano, PhD.</w:t>
-            </w:r>
-          </w:p>
-          <w:p>
-            <w:pPr>
-              <w:spacing w:after="0"/>
-              <w:jc w:val="center"/>
-              <w:rPr>
-                <w:lang w:val="pt-PT"/>
-              </w:rPr>
-            </w:pPr>
-            <w:r>
-              <w:rPr>
-                <w:lang w:val="es-EC"/>
-              </w:rPr>
-              <w:t>Docente</w:t>
-            </w:r>
-          </w:p>
-        </w:tc>
-      </w:tr>
-      <w:tr>
-        <w:trPr>
-          <w:trHeight w:val="2211"/>
-        </w:trPr>
-        <w:tc>
-          <w:tcPr>
-            <w:tcW w:w="4390" w:type="dxa"/>
-            <w:vAlign w:val="bottom"/>
-          </w:tcPr>
-          <w:p>
-            <w:pPr>
-              <w:spacing w:after="0"/>
-              <w:jc w:val="center"/>
-              <w:rPr>
-                <w:lang w:val="es-EC"/>
-              </w:rPr>
-            </w:pPr>
-            <w:r>
-              <w:rPr>
-                <w:lang w:val="es-EC"/>
-              </w:rPr>
-              <w:t>Dr. Jhonny Villafuerte Holguín, PhD.</w:t>
-            </w:r>
-          </w:p>
-          <w:p>
-            <w:pPr>
-              <w:spacing w:after="0"/>
-              <w:jc w:val="center"/>
-              <w:rPr>
-                <w:lang w:val="es-EC"/>
-              </w:rPr>
-            </w:pPr>
-            <w:r>
-              <w:rPr>
-                <w:lang w:val="es-EC"/>
-              </w:rPr>
-              <w:t xml:space="preserve">Docente   </w:t>
-            </w:r>
-          </w:p>
-        </w:tc>
-        <w:tc>
-          <w:tcPr>
-            <w:tcW w:w="4813" w:type="dxa"/>
-            <w:vAlign w:val="bottom"/>
-          </w:tcPr>
-          <w:p>
-            <w:pPr>
-              <w:spacing w:after="0"/>
-              <w:jc w:val="center"/>
-              <w:rPr>
-                <w:lang w:val="pt-PT"/>
-              </w:rPr>
-            </w:pPr>
-            <w:r>
-              <w:rPr>
-                <w:lang w:val="pt-PT"/>
-              </w:rPr>
-              <w:t>Lic. Cintya Zambrano Zambrano, Mg.</w:t>
-            </w:r>
-          </w:p>
-          <w:p>
-            <w:pPr>
-              <w:spacing w:after="0"/>
-              <w:jc w:val="center"/>
-              <w:rPr>
-                <w:lang w:val="pt-PT"/>
-              </w:rPr>
-            </w:pPr>
-            <w:r>
-              <w:rPr>
-                <w:lang w:val="es-EC"/>
-              </w:rPr>
-              <w:t>Docente</w:t>
             </w:r>
           </w:p>
         </w:tc>
@@ -1465,12 +1133,7 @@
               </w:rPr>
             </w:pPr>
             <w:r>
-              <w:rPr>
-                <w:rFonts w:cs="Arial"/>
-                <w:sz w:val="10"/>
-                <w:szCs w:val="10"/>
-              </w:rPr>
-              <w:t>Yasmín Bermúdez Velasco</w:t>
+              <w:t>{{elaborado_titulo}} {{elaborado_nombre}}</w:t>
             </w:r>
           </w:p>
         </w:tc>

</xml_diff>

<commit_message>
fix: acta tecnica - placeholders individuales para firmantes
</commit_message>
<xml_diff>
--- a/resources/Acta_Tecnica.docx
+++ b/resources/Acta_Tecnica.docx
@@ -454,13 +454,25 @@
             <w:tcW w:type="dxa" w:w="5669"/>
           </w:tcPr>
           <w:p>
+            <w:pPr>
+              <w:spacing w:before="40" w:after="40"/>
+            </w:pPr>
             <w:r>
-              <w:t>{{f.nombre}}</w:t>
+              <w:rPr>
+                <w:rFonts w:ascii="Arial" w:hAnsi="Arial"/>
+                <w:sz w:val="20"/>
+              </w:rPr>
+              <w:t>{{firmante_1_nombre}}</w:t>
             </w:r>
-          </w:p>
-          <w:p>
             <w:r>
-              <w:t>{{f.cargo}}</w:t>
+              <w:br/>
+            </w:r>
+            <w:r>
+              <w:rPr>
+                <w:rFonts w:ascii="Arial" w:hAnsi="Arial"/>
+                <w:sz w:val="18"/>
+              </w:rPr>
+              <w:t>{{firmante_1_cargo}}</w:t>
             </w:r>
           </w:p>
         </w:tc>
@@ -475,19 +487,334 @@
       </w:tr>
       <w:tr>
         <w:tc>
+          <w:tcPr>
+            <w:tcW w:type="dxa" w:w="5669"/>
+          </w:tcPr>
           <w:p>
+            <w:pPr>
+              <w:spacing w:before="40" w:after="40"/>
+            </w:pPr>
             <w:r>
-              <w:t>{%tr for f in firmantes %}</w:t>
+              <w:rPr>
+                <w:rFonts w:ascii="Arial" w:hAnsi="Arial"/>
+                <w:sz w:val="20"/>
+              </w:rPr>
+              <w:t>{{firmante_2_nombre}}</w:t>
             </w:r>
+            <w:r>
+              <w:br/>
+            </w:r>
+            <w:r>
+              <w:rPr>
+                <w:rFonts w:ascii="Arial" w:hAnsi="Arial"/>
+                <w:sz w:val="18"/>
+              </w:rPr>
+              <w:t>{{firmante_2_cargo}}</w:t>
+            </w:r>
+          </w:p>
+        </w:tc>
+        <w:tc>
+          <w:tcPr>
+            <w:tcW w:type="dxa" w:w="3402"/>
+          </w:tcPr>
+          <w:p>
+            <w:r/>
           </w:p>
         </w:tc>
       </w:tr>
       <w:tr>
         <w:tc>
+          <w:tcPr>
+            <w:tcW w:type="dxa" w:w="5669"/>
+          </w:tcPr>
           <w:p>
+            <w:pPr>
+              <w:spacing w:before="40" w:after="40"/>
+            </w:pPr>
             <w:r>
-              <w:t>{%tr endfor %}</w:t>
+              <w:rPr>
+                <w:rFonts w:ascii="Arial" w:hAnsi="Arial"/>
+                <w:sz w:val="20"/>
+              </w:rPr>
+              <w:t>{{firmante_3_nombre}}</w:t>
             </w:r>
+            <w:r>
+              <w:br/>
+            </w:r>
+            <w:r>
+              <w:rPr>
+                <w:rFonts w:ascii="Arial" w:hAnsi="Arial"/>
+                <w:sz w:val="18"/>
+              </w:rPr>
+              <w:t>{{firmante_3_cargo}}</w:t>
+            </w:r>
+          </w:p>
+        </w:tc>
+        <w:tc>
+          <w:tcPr>
+            <w:tcW w:type="dxa" w:w="3402"/>
+          </w:tcPr>
+          <w:p>
+            <w:r/>
+          </w:p>
+        </w:tc>
+      </w:tr>
+      <w:tr>
+        <w:tc>
+          <w:tcPr>
+            <w:tcW w:type="dxa" w:w="5669"/>
+          </w:tcPr>
+          <w:p>
+            <w:pPr>
+              <w:spacing w:before="40" w:after="40"/>
+            </w:pPr>
+            <w:r>
+              <w:rPr>
+                <w:rFonts w:ascii="Arial" w:hAnsi="Arial"/>
+                <w:sz w:val="20"/>
+              </w:rPr>
+              <w:t>{{firmante_4_nombre}}</w:t>
+            </w:r>
+            <w:r>
+              <w:br/>
+            </w:r>
+            <w:r>
+              <w:rPr>
+                <w:rFonts w:ascii="Arial" w:hAnsi="Arial"/>
+                <w:sz w:val="18"/>
+              </w:rPr>
+              <w:t>{{firmante_4_cargo}}</w:t>
+            </w:r>
+          </w:p>
+        </w:tc>
+        <w:tc>
+          <w:tcPr>
+            <w:tcW w:type="dxa" w:w="3402"/>
+          </w:tcPr>
+          <w:p>
+            <w:r/>
+          </w:p>
+        </w:tc>
+      </w:tr>
+      <w:tr>
+        <w:tc>
+          <w:tcPr>
+            <w:tcW w:type="dxa" w:w="5669"/>
+          </w:tcPr>
+          <w:p>
+            <w:pPr>
+              <w:spacing w:before="40" w:after="40"/>
+            </w:pPr>
+            <w:r>
+              <w:rPr>
+                <w:rFonts w:ascii="Arial" w:hAnsi="Arial"/>
+                <w:sz w:val="20"/>
+              </w:rPr>
+              <w:t>{{firmante_5_nombre}}</w:t>
+            </w:r>
+            <w:r>
+              <w:br/>
+            </w:r>
+            <w:r>
+              <w:rPr>
+                <w:rFonts w:ascii="Arial" w:hAnsi="Arial"/>
+                <w:sz w:val="18"/>
+              </w:rPr>
+              <w:t>{{firmante_5_cargo}}</w:t>
+            </w:r>
+          </w:p>
+        </w:tc>
+        <w:tc>
+          <w:tcPr>
+            <w:tcW w:type="dxa" w:w="3402"/>
+          </w:tcPr>
+          <w:p>
+            <w:r/>
+          </w:p>
+        </w:tc>
+      </w:tr>
+      <w:tr>
+        <w:tc>
+          <w:tcPr>
+            <w:tcW w:type="dxa" w:w="5669"/>
+          </w:tcPr>
+          <w:p>
+            <w:pPr>
+              <w:spacing w:before="40" w:after="40"/>
+            </w:pPr>
+            <w:r>
+              <w:rPr>
+                <w:rFonts w:ascii="Arial" w:hAnsi="Arial"/>
+                <w:sz w:val="20"/>
+              </w:rPr>
+              <w:t>{{firmante_6_nombre}}</w:t>
+            </w:r>
+            <w:r>
+              <w:br/>
+            </w:r>
+            <w:r>
+              <w:rPr>
+                <w:rFonts w:ascii="Arial" w:hAnsi="Arial"/>
+                <w:sz w:val="18"/>
+              </w:rPr>
+              <w:t>{{firmante_6_cargo}}</w:t>
+            </w:r>
+          </w:p>
+        </w:tc>
+        <w:tc>
+          <w:tcPr>
+            <w:tcW w:type="dxa" w:w="3402"/>
+          </w:tcPr>
+          <w:p>
+            <w:r/>
+          </w:p>
+        </w:tc>
+      </w:tr>
+      <w:tr>
+        <w:tc>
+          <w:tcPr>
+            <w:tcW w:type="dxa" w:w="5669"/>
+          </w:tcPr>
+          <w:p>
+            <w:pPr>
+              <w:spacing w:before="40" w:after="40"/>
+            </w:pPr>
+            <w:r>
+              <w:rPr>
+                <w:rFonts w:ascii="Arial" w:hAnsi="Arial"/>
+                <w:sz w:val="20"/>
+              </w:rPr>
+              <w:t>{{firmante_7_nombre}}</w:t>
+            </w:r>
+            <w:r>
+              <w:br/>
+            </w:r>
+            <w:r>
+              <w:rPr>
+                <w:rFonts w:ascii="Arial" w:hAnsi="Arial"/>
+                <w:sz w:val="18"/>
+              </w:rPr>
+              <w:t>{{firmante_7_cargo}}</w:t>
+            </w:r>
+          </w:p>
+        </w:tc>
+        <w:tc>
+          <w:tcPr>
+            <w:tcW w:type="dxa" w:w="3402"/>
+          </w:tcPr>
+          <w:p>
+            <w:r/>
+          </w:p>
+        </w:tc>
+      </w:tr>
+      <w:tr>
+        <w:tc>
+          <w:tcPr>
+            <w:tcW w:type="dxa" w:w="5669"/>
+          </w:tcPr>
+          <w:p>
+            <w:pPr>
+              <w:spacing w:before="40" w:after="40"/>
+            </w:pPr>
+            <w:r>
+              <w:rPr>
+                <w:rFonts w:ascii="Arial" w:hAnsi="Arial"/>
+                <w:sz w:val="20"/>
+              </w:rPr>
+              <w:t>{{firmante_8_nombre}}</w:t>
+            </w:r>
+            <w:r>
+              <w:br/>
+            </w:r>
+            <w:r>
+              <w:rPr>
+                <w:rFonts w:ascii="Arial" w:hAnsi="Arial"/>
+                <w:sz w:val="18"/>
+              </w:rPr>
+              <w:t>{{firmante_8_cargo}}</w:t>
+            </w:r>
+          </w:p>
+        </w:tc>
+        <w:tc>
+          <w:tcPr>
+            <w:tcW w:type="dxa" w:w="3402"/>
+          </w:tcPr>
+          <w:p>
+            <w:r/>
+          </w:p>
+        </w:tc>
+      </w:tr>
+      <w:tr>
+        <w:tc>
+          <w:tcPr>
+            <w:tcW w:type="dxa" w:w="5669"/>
+          </w:tcPr>
+          <w:p>
+            <w:pPr>
+              <w:spacing w:before="40" w:after="40"/>
+            </w:pPr>
+            <w:r>
+              <w:rPr>
+                <w:rFonts w:ascii="Arial" w:hAnsi="Arial"/>
+                <w:sz w:val="20"/>
+              </w:rPr>
+              <w:t>{{firmante_9_nombre}}</w:t>
+            </w:r>
+            <w:r>
+              <w:br/>
+            </w:r>
+            <w:r>
+              <w:rPr>
+                <w:rFonts w:ascii="Arial" w:hAnsi="Arial"/>
+                <w:sz w:val="18"/>
+              </w:rPr>
+              <w:t>{{firmante_9_cargo}}</w:t>
+            </w:r>
+          </w:p>
+        </w:tc>
+        <w:tc>
+          <w:tcPr>
+            <w:tcW w:type="dxa" w:w="3402"/>
+          </w:tcPr>
+          <w:p>
+            <w:r/>
+          </w:p>
+        </w:tc>
+      </w:tr>
+      <w:tr>
+        <w:tc>
+          <w:tcPr>
+            <w:tcW w:type="dxa" w:w="5669"/>
+          </w:tcPr>
+          <w:p>
+            <w:pPr>
+              <w:spacing w:before="40" w:after="40"/>
+            </w:pPr>
+            <w:r>
+              <w:rPr>
+                <w:rFonts w:ascii="Arial" w:hAnsi="Arial"/>
+                <w:sz w:val="20"/>
+              </w:rPr>
+              <w:t>{{firmante_10_nombre}}</w:t>
+            </w:r>
+            <w:r>
+              <w:br/>
+            </w:r>
+            <w:r>
+              <w:rPr>
+                <w:rFonts w:ascii="Arial" w:hAnsi="Arial"/>
+                <w:sz w:val="18"/>
+              </w:rPr>
+              <w:t>{{firmante_10_cargo}}</w:t>
+            </w:r>
+          </w:p>
+        </w:tc>
+        <w:tc>
+          <w:tcPr>
+            <w:tcW w:type="dxa" w:w="3402"/>
+          </w:tcPr>
+          <w:p>
+            <w:r/>
           </w:p>
         </w:tc>
       </w:tr>

</xml_diff>